<commit_message>
actualiza la propuesta con las cifras de las fuentes adquiridas
</commit_message>
<xml_diff>
--- a/deliveries/week05/ProjectProposal.docx
+++ b/deliveries/week05/ProjectProposal.docx
@@ -120,7 +120,7 @@
           <w:rFonts w:ascii="Lato" w:cs="Lato" w:eastAsia="Lato" w:hAnsi="Lato"/>
           <w:rtl w:val="0"/>
         </w:rPr>
-        <w:t xml:space="preserve">Denzel (Cloud &amp; DevOps Engineer) • Jyns (Machine Learning Engineer) • Lisseth (Data Analyst) • Math (Full-Stack Developer &amp; UX/UI Designer)</w:t>
+        <w:t>Denzel (Cloud &amp; DevOps Engineer) • Jyns (Machine Learning Engineer) • Lisseth (Data Analyst) • Mafer (Full-Stack Developer &amp; UX/UI Designer)</w:t>
       </w:r>
     </w:p>
     <w:p>
@@ -157,7 +157,7 @@
           <w:rFonts w:ascii="Lato" w:cs="Lato" w:eastAsia="Lato" w:hAnsi="Lato"/>
           <w:rtl w:val="0"/>
         </w:rPr>
-        <w:t xml:space="preserve">InmoScore es un asistente de búsqueda inmobiliaria dirigido a compradores de vivienda propia en Lima Metropolitana. A diferencia de los portales inmobiliarios actuales, que solo permiten filtrar por precio, distrito y número de habitaciones, InmoScore integra tres componentes de aprendizaje automático — un motor de valoración de precios, un modelo de visión por computadora para evaluar la calidad del entorno, y un motor de recomendación personalizado — para identificar inmuebles subvalorados y priorizarlos según el perfil financiero y de estilo de vida de cada comprador. Cada recomendación se entrega junto con una explicación en lenguaje natural, buscando generar confianza en un proceso de decisión que hoy se realiza con información incompleta.</w:t>
+        <w:t>InmoScore es un asistente de búsqueda inmobiliaria dirigido a compradores de vivienda propia en Lima Metropolitana. Los portales actuales permiten filtrar por precio, distrito y número de habitaciones; InmoScore agrega sobre ese mismo inventario tres componentes de aprendizaje automático: un motor de valoración de precios, un modelo de visión por computadora para evaluar la calidad del entorno y un motor de recomendación personalizado. El sistema se construye sobre seis fuentes públicas ya consolidadas, entre ellas 24 148 transacciones inmobiliarias cerradas y 3 987 avisos de venta, e identifica inmuebles subvalorados priorizándolos según el perfil financiero y de estilo de vida de cada comprador. Cada recomendación se entrega junto con una explicación en lenguaje natural.</w:t>
       </w:r>
     </w:p>
     <w:p>
@@ -194,7 +194,7 @@
           <w:rFonts w:ascii="Lato" w:cs="Lato" w:eastAsia="Lato" w:hAnsi="Lato"/>
           <w:rtl w:val="0"/>
         </w:rPr>
-        <w:t xml:space="preserve">Comprar vivienda propia es, para la mayoría de las personas, la decisión financiera más grande de su vida. En Lima Metropolitana, este proceso depende casi exclusivamente de portales como Urbania y Properati, que muestran el precio publicado y fotografías del inmueble, pero no ofrecen ninguna referencia objetiva sobre si ese precio corresponde al valor real de mercado, ni información cuantificada sobre el entorno (seguridad, calidad urbana, áreas verdes) o sobre la confiabilidad de la constructora responsable del proyecto.</w:t>
+        <w:t>Comprar vivienda propia es, para la mayoría de las personas, la decisión financiera más grande de su vida, y en Lima el mercado es marcadamente heterogéneo: el precio mediano del metro cuadrado va de S/ 9 299 en Barranco a S/ 2 773 en San Martín de Porres, una diferencia de 3,4 veces. La incidencia delictiva varía en proporción similar, de 11 a 81 denuncias por cada mil habitantes según el distrito. Ninguno de esos dos contextos aparece en el aviso: Urbania y Properati publican precio y fotografías, sin referencia de valor de mercado, datos del entorno ni historial de la constructora responsable del proyecto.</w:t>
       </w:r>
     </w:p>
     <w:p>
@@ -209,7 +209,7 @@
           <w:rFonts w:ascii="Lato" w:cs="Lato" w:eastAsia="Lato" w:hAnsi="Lato"/>
           <w:rtl w:val="0"/>
         </w:rPr>
-        <w:t xml:space="preserve">Esta carencia de información estructurada, combinada con la existencia de fuentes de datos públicas y verificables (listados inmobiliarios, puntos de interés geoespaciales, registros de criminalidad, imágenes urbanas y registros de proyectos inmobiliarios), constituye una oportunidad concreta para desarrollar un Producto de Datos que reduzca la asimetría de información entre vendedores y compradores.</w:t>
+        <w:t>La información que falta en el aviso existe, pero está dispersa entre seis entidades y en formatos no comparables. Durante la fase de adquisición se consolidaron las transacciones cerradas del Impuesto de Alcabala del SAT de Lima (24 148 compraventas en 44 distritos), los avisos de venta de Urbania (3 987 en 20 distritos), la serie oficial de precios del BCRP (957 observaciones trimestrales desde 1998), los puntos de interés de OpenStreetMap (16 987), las denuncias policiales del SIDPOL (29 833 registros de Lima y Callao), los proyectos y promotores del Fondo MIVIVIENDA (747 y 460 respectivamente) y los estratos de ingreso por manzana del INEI (9 206 manzanas). Reunirlas en un feature store único es la oportunidad concreta para reducir la asimetría de información entre vendedores y compradores.</w:t>
       </w:r>
     </w:p>
     <w:p>
@@ -532,7 +532,7 @@
           <w:vertAlign w:val="baseline"/>
           <w:rtl w:val="0"/>
         </w:rPr>
-        <w:t xml:space="preserve">Para el comprador: menor tiempo de búsqueda y mayor certeza al identificar inmuebles subvalorados y descartar riesgos de entorno o de constructora.</w:t>
+        <w:t>Para el comprador: contraste del precio pedido contra transacciones cerradas de la misma zona, más un índice de entorno calculado para 47 distritos.</w:t>
       </w:r>
     </w:p>
     <w:p>
@@ -573,7 +573,7 @@
           <w:vertAlign w:val="baseline"/>
           <w:rtl w:val="0"/>
         </w:rPr>
-        <w:t xml:space="preserve">Para el mercado: mayor transparencia, reduciendo la asimetría de información que hoy favorece exclusivamente al vendedor.</w:t>
+        <w:t>Para el mercado: visibilidad del historial de 460 promotores registrados ante el Fondo MIVIVIENDA, hoy accesible solo mediante consultas caso por caso.</w:t>
       </w:r>
     </w:p>
     <w:p>
@@ -614,7 +614,7 @@
           <w:vertAlign w:val="baseline"/>
           <w:rtl w:val="0"/>
         </w:rPr>
-        <w:t xml:space="preserve">Para el curso: un caso de estudio robusto de un producto de datos híbrido (predictivo + prescriptivo) construido sobre fuentes de datos verificables.</w:t>
+        <w:t>Para el curso: un producto de datos híbrido, predictivo y prescriptivo, construido sobre seis fuentes públicas y reproducible mediante scripts versionados.</w:t>
       </w:r>
     </w:p>
     <w:p>
@@ -714,7 +714,7 @@
           <w:vertAlign w:val="baseline"/>
           <w:rtl w:val="0"/>
         </w:rPr>
-        <w:t xml:space="preserve">Visualización geoespacial estática que cruza criminalidad y precio por zona — descartada por ser pasiva y no adaptarse al usuario.</w:t>
+        <w:t>Visualización geoespacial estática que cruza criminalidad y precio por zona: descartada por ser pasiva y no adaptarse al usuario.</w:t>
       </w:r>
     </w:p>
     <w:p>
@@ -755,7 +755,7 @@
           <w:vertAlign w:val="baseline"/>
           <w:rtl w:val="0"/>
         </w:rPr>
-        <w:t xml:space="preserve">Asistente conversacional (LLM) que responde preguntas sobre zonas y precios — descartado por no generar un ranking accionable ni comparable entre propiedades.</w:t>
+        <w:t>Asistente conversacional (LLM) que responde preguntas sobre zonas y precios: descartado por no generar un ranking accionable ni comparable entre propiedades.</w:t>
       </w:r>
     </w:p>
     <w:p>
@@ -796,7 +796,7 @@
           <w:vertAlign w:val="baseline"/>
           <w:rtl w:val="0"/>
         </w:rPr>
-        <w:t xml:space="preserve">InmoScore: sistema que identifica inmuebles subvalorados, evalúa su entorno con visión por computadora y genera un ranking personalizado explicado — seleccionada, por ser la única que combina un componente predictivo real con una recomendación accionable y explicable.</w:t>
+        <w:t>InmoScore, sistema que identifica inmuebles subvalorados, evalúa su entorno y genera un ranking personalizado explicado: seleccionada, por ser la única que combina un componente predictivo real con una recomendación accionable y explicable.</w:t>
       </w:r>
     </w:p>
     <w:p>
@@ -859,7 +859,7 @@
           <w:vertAlign w:val="baseline"/>
           <w:rtl w:val="0"/>
         </w:rPr>
-        <w:t xml:space="preserve">Cobertura geográfica: Lima Metropolitana.</w:t>
+        <w:t>Cobertura geográfica: Lima Metropolitana y Callao.</w:t>
       </w:r>
     </w:p>
     <w:p>
@@ -900,7 +900,7 @@
           <w:vertAlign w:val="baseline"/>
           <w:rtl w:val="0"/>
         </w:rPr>
-        <w:t xml:space="preserve">Motor de valoración: modelo de regresión que estima un precio de referencia y un score de oportunidad por inmueble.</w:t>
+        <w:t>Motor de valoración: modelo de regresión que estima un precio de referencia y un score de oportunidad por inmueble, evaluado contra las transacciones del Impuesto de Alcabala y comparado con el baseline de precio mediano por m² y distrito.</w:t>
       </w:r>
     </w:p>
     <w:p>
@@ -941,7 +941,7 @@
           <w:vertAlign w:val="baseline"/>
           <w:rtl w:val="0"/>
         </w:rPr>
-        <w:t xml:space="preserve">Índice compuesto de zona: combinación de seguridad, conveniencia urbana (POIs) y percepción visual del entorno.</w:t>
+        <w:t>Índice compuesto de zona: combinación de seguridad, conveniencia urbana (POIs) y percepción visual del entorno. Los dos primeros componentes ya están calculados para 47 distritos; el tercero depende de conseguir un dataset de imágenes de calle, hoy sin fuente definida.</w:t>
       </w:r>
     </w:p>
     <w:p>
@@ -1168,7 +1168,7 @@
           <w:vertAlign w:val="baseline"/>
           <w:rtl w:val="0"/>
         </w:rPr>
-        <w:t xml:space="preserve">Score de confiabilidad de constructora con cobertura exhaustiva (se trabajará con una muestra representativa de constructoras).</w:t>
+        <w:t>Score de confiabilidad de constructora basado en cumplimiento de plazos: ese historial exige acceso al CIPIEC del Ministerio de Vivienda, que requiere autenticación. En esta iteración el score se construye sobre volumen de obra entregada y antigüedad en el mercado.</w:t>
       </w:r>
     </w:p>
     <w:p>
@@ -1246,21 +1246,7 @@
           <w:rFonts w:ascii="Lato" w:cs="Lato" w:eastAsia="Lato" w:hAnsi="Lato"/>
           <w:rtl w:val="0"/>
         </w:rPr>
-        <w:t xml:space="preserve">Las siguientes iteraciones del proyecto (Week 6 en adelante) </w:t>
-      </w:r>
-      <w:r>
-        <w:rPr>
-          <w:rFonts w:ascii="Lato" w:cs="Lato" w:eastAsia="Lato" w:hAnsi="Lato"/>
-          <w:rtl w:val="0"/>
-        </w:rPr>
-        <w:t xml:space="preserve">profundizarán</w:t>
-      </w:r>
-      <w:r>
-        <w:rPr>
-          <w:rFonts w:ascii="Lato" w:cs="Lato" w:eastAsia="Lato" w:hAnsi="Lato"/>
-          <w:rtl w:val="0"/>
-        </w:rPr>
-        <w:t xml:space="preserve"> en el análisis exploratorio de los datos recolectados, la selección formal del método de modelado para cada componente, y el desarrollo del prototipo funcional, conforme al cronograma del curso DS3022.</w:t>
+        <w:t>Las siguientes iteraciones, de Week 6 en adelante, se concentran en geocodificar las direcciones de los avisos, requisito para calcular las distancias a puntos de interés; entrenar el motor de valoración y medir su error absoluto medio contra las transacciones de Alcabala; y definir el criterio de comparación por percentil de distrito, dado que cocheras y depósitos se inscriben como predios independientes y representan el 64 % de las compraventas en distritos como San Isidro.</w:t>
       </w:r>
     </w:p>
     <w:sectPr>

</xml_diff>